<commit_message>
BSI.IT.27.C7: restructure workpapers by the 9-step test procedure
- WP2 CPA: attribute table columns and summary of results organized by steps 1-9
- Walkthrough tab 2 grouped by steps 1-9; matrix headers mapped to steps
- Sample of 1 (2025 Q3, 2026 Q1): testing table by steps 1-9

Co-Authored-By: Claude Opus 5.5 <noreply@anthropic.com>
Claude-Session: https://claude.ai/code/session_01GtAt3iBzX5VYFEMTgXwPkP
</commit_message>
<xml_diff>
--- a/BSI.IT.27.C7 Network Device Admin Accoun/BSI.IT.27.C7 Final 07.2025-06.2026/00 Final Workpaper/BSI.IT.27.C7.04a Sample of 1 - Sample 1 2025 Q3 Network Device Admin Account Review.docx
+++ b/BSI.IT.27.C7 Network Device Admin Accoun/BSI.IT.27.C7 Final 07.2025-06.2026/00 Final Workpaper/BSI.IT.27.C7.04a Sample of 1 - Sample 1 2025 Q3 Network Device Admin Account Review.docx
@@ -1151,7 +1151,7 @@
         <w:rPr>
           <w:rFonts w:ascii="Aptos" w:hAnsi="Aptos"/>
         </w:rPr>
-        <w:t xml:space="preserve">3. Testing Performed and Results</w:t>
+        <w:t xml:space="preserve">3. Testing Performed and Results (Test Steps 1-9)</w:t>
       </w:r>
     </w:p>
     <w:tbl>
@@ -1194,7 +1194,7 @@
                 <w:color w:val="FFFFFF"/>
                 <w:sz w:val="17"/>
               </w:rPr>
-              <w:t xml:space="preserve">Attribute</w:t>
+              <w:t xml:space="preserve">Test step</w:t>
             </w:r>
           </w:p>
         </w:tc>
@@ -1221,7 +1221,7 @@
                 <w:color w:val="FFFFFF"/>
                 <w:sz w:val="17"/>
               </w:rPr>
-              <w:t xml:space="preserve">Evidence evaluated</w:t>
+              <w:t xml:space="preserve">Evidence evaluated / work performed</w:t>
             </w:r>
           </w:p>
         </w:tc>
@@ -1305,7 +1305,7 @@
               <w:rPr>
                 <w:sz w:val="16"/>
               </w:rPr>
-              <w:t xml:space="preserve">Frequency (A1)</w:t>
+              <w:t xml:space="preserve">1. Obtain Evidence</w:t>
             </w:r>
           </w:p>
         </w:tc>
@@ -1329,7 +1329,7 @@
               <w:rPr>
                 <w:sz w:val="16"/>
               </w:rPr>
-              <w:t xml:space="preserve">Certifications in the period: 2025 Q3 (launched August 1, 2025) and 2026 Q1 (launched April 9, 2026); 2025 Q4 not provided.</w:t>
+              <w:t xml:space="preserve">2025 Q3 SailPoint Manager / Owner certification records (campaign, decisions, sign-off), BSI AD extract November 25, 2025, revocation population and Netwrix removal logs, IAM Standard v10.0, PAM Recertification Procedure v2.0, PAM Definition of Privilege v10.0.</w:t>
             </w:r>
           </w:p>
         </w:tc>
@@ -1379,7 +1379,7 @@
               <w:rPr>
                 <w:sz w:val="16"/>
               </w:rPr>
-              <w:t xml:space="preserve">One review in each half of the period (2025 Q3 covers July - December 2025); 2025 Q4 not evidenced (Procedure requires quarterly).</w:t>
+              <w:t xml:space="preserve">Evidence obtained; ServiceNow revocation tickets not provided; IAM Standard v9.0 / Procedure v1.0 in force in August 2025 requested.</w:t>
             </w:r>
           </w:p>
         </w:tc>
@@ -1409,7 +1409,7 @@
               <w:rPr>
                 <w:sz w:val="16"/>
               </w:rPr>
-              <w:t xml:space="preserve">Population completeness (A2)</w:t>
+              <w:t xml:space="preserve">2. Report Completeness and Accuracy</w:t>
             </w:r>
           </w:p>
         </w:tc>
@@ -1433,7 +1433,7 @@
               <w:rPr>
                 <w:sz w:val="16"/>
               </w:rPr>
-              <w:t xml:space="preserve">BSI AD extract November 25, 2025 compared to the 88 certified memberships.</w:t>
+              <w:t xml:space="preserve">Certified population (88 memberships) reconciled to the BSI AD extract November 25, 2025 (authoritative source).</w:t>
             </w:r>
           </w:p>
         </w:tc>
@@ -1457,9 +1457,9 @@
             <w:r>
               <w:rPr>
                 <w:sz w:val="16"/>
-                <w:color w:val="107C41"/>
+                <w:color w:val="B45F06"/>
               </w:rPr>
-              <w:t xml:space="preserve">Pass</w:t>
+              <w:t xml:space="preserve">Pass (observation)</w:t>
             </w:r>
           </w:p>
         </w:tc>
@@ -1483,7 +1483,7 @@
               <w:rPr>
                 <w:sz w:val="16"/>
               </w:rPr>
-              <w:t xml:space="preserve">All AD members certified except X842395 (added 8/30/2025) and MIA25172 / MIA25175 in ISEAdmin (added 9/10/2025) - added after launch and certified in 2026 Q1.</w:t>
+              <w:t xml:space="preserve">Differences explained: revoked and removed memberships; N584407 left after review; X842395 (8/30/2025) and MIA25172 / MIA25175 ISEAdmin (9/10/2025) added after launch and certified in 2026 Q1.</w:t>
             </w:r>
           </w:p>
         </w:tc>
@@ -1513,7 +1513,7 @@
               <w:rPr>
                 <w:sz w:val="16"/>
               </w:rPr>
-              <w:t xml:space="preserve">Reviewer (A3)</w:t>
+              <w:t xml:space="preserve">3. Population and Scope</w:t>
             </w:r>
           </w:p>
         </w:tc>
@@ -1537,7 +1537,7 @@
               <w:rPr>
                 <w:sz w:val="16"/>
               </w:rPr>
-              <w:t xml:space="preserve">Decision makers compared to the identity, line manager and account owner.</w:t>
+              <w:t xml:space="preserve">Four groups of PAM Definition of Privilege sec. 3.3; administrator / user and service accounts.</w:t>
             </w:r>
           </w:p>
         </w:tc>
@@ -1561,9 +1561,9 @@
             <w:r>
               <w:rPr>
                 <w:sz w:val="16"/>
-                <w:color w:val="107C41"/>
+                <w:color w:val="B45F06"/>
               </w:rPr>
-              <w:t xml:space="preserve">Pass</w:t>
+              <w:t xml:space="preserve">Pass (observation)</w:t>
             </w:r>
           </w:p>
         </w:tc>
@@ -1587,7 +1587,7 @@
               <w:rPr>
                 <w:sz w:val="16"/>
               </w:rPr>
-              <w:t xml:space="preserve">Line managers (person) and owners (service accounts); no self-review.</w:t>
+              <w:t xml:space="preserve">78 person and 10 service-account memberships in scope; none excluded. Network_support (sec. 3.2) not in the control scope - management to confirm.</w:t>
             </w:r>
           </w:p>
         </w:tc>
@@ -1617,7 +1617,7 @@
               <w:rPr>
                 <w:sz w:val="16"/>
               </w:rPr>
-              <w:t xml:space="preserve">Review completion (A4)</w:t>
+              <w:t xml:space="preserve">4. Control Execution</w:t>
             </w:r>
           </w:p>
         </w:tc>
@@ -1641,7 +1641,7 @@
               <w:rPr>
                 <w:sz w:val="16"/>
               </w:rPr>
-              <w:t xml:space="preserve">88/88 memberships with a final decision; decisions August 6 - August 28, 2025.</w:t>
+              <w:t xml:space="preserve">Campaign launch August 1 / 4, 2025 (PAM / IAM); decision makers vs identity, manager and owner; decisions August 6 - 28, 2025; IAMS status and AD status November 25, 2025 for approved access.</w:t>
             </w:r>
           </w:p>
         </w:tc>
@@ -1665,9 +1665,9 @@
             <w:r>
               <w:rPr>
                 <w:sz w:val="16"/>
-                <w:color w:val="107C41"/>
+                <w:color w:val="C00000"/>
               </w:rPr>
-              <w:t xml:space="preserve">Pass</w:t>
+              <w:t xml:space="preserve">Fail</w:t>
             </w:r>
           </w:p>
         </w:tc>
@@ -1691,7 +1691,7 @@
               <w:rPr>
                 <w:sz w:val="16"/>
               </w:rPr>
-              <w:t xml:space="preserve">Review completed and signed off.</w:t>
+              <w:t xml:space="preserve">Initiation, reviewer authorization and decisions (88/88) Pass; 33 revocations identified, but 14 memberships approved that required revocation: E2 IAMS terminated 12/31/2024 MIA25103, MIA25104, MIA25105, MIA25106, MIA25249, MIA25250, MIA25251; E1 AD disabled MIA25103.</w:t>
             </w:r>
           </w:p>
         </w:tc>
@@ -1721,7 +1721,7 @@
               <w:rPr>
                 <w:sz w:val="16"/>
               </w:rPr>
-              <w:t xml:space="preserve">Appropriateness of access (A5)</w:t>
+              <w:t xml:space="preserve">5. Control Results</w:t>
             </w:r>
           </w:p>
         </w:tc>
@@ -1745,7 +1745,7 @@
               <w:rPr>
                 <w:sz w:val="16"/>
               </w:rPr>
-              <w:t xml:space="preserve">IAMS status in the certification and AD status (November 25, 2025) compared to approved memberships.</w:t>
+              <w:t xml:space="preserve">33 memberships revoked August 28, 2025; Netwrix removals September 2 - 8, 2025; AD extract November 25, 2025.</w:t>
             </w:r>
           </w:p>
         </w:tc>
@@ -1795,7 +1795,7 @@
               <w:rPr>
                 <w:sz w:val="16"/>
               </w:rPr>
-              <w:t xml:space="preserve">14 memberships approved: E2 IAMS terminated 12/31/2024 MIA25103, MIA25104, MIA25105, MIA25106, MIA25249, MIA25250, MIA25251; E1 AD disabled MIA25103.</w:t>
+              <w:t xml:space="preserve">Removed within 30 business days and matching the decisions, but 6 memberships (MIA25142, MIA25172, MIA25175, X453396) were members again on November 25, 2025 - removal not sustained (E3).</w:t>
             </w:r>
           </w:p>
         </w:tc>
@@ -1825,7 +1825,7 @@
               <w:rPr>
                 <w:sz w:val="16"/>
               </w:rPr>
-              <w:t xml:space="preserve">Revocation within SLA (A6)</w:t>
+              <w:t xml:space="preserve">6. Exception Handling</w:t>
             </w:r>
           </w:p>
         </w:tc>
@@ -1849,7 +1849,7 @@
               <w:rPr>
                 <w:sz w:val="16"/>
               </w:rPr>
-              <w:t xml:space="preserve">33 memberships revoked August 28, 2025; Netwrix removals September 2 - 8, 2025; AD extract November 25, 2025.</w:t>
+              <w:t xml:space="preserve">Exception records, tickets or comments for the step 4-5 exceptions.</w:t>
             </w:r>
           </w:p>
         </w:tc>
@@ -1899,7 +1899,7 @@
               <w:rPr>
                 <w:sz w:val="16"/>
               </w:rPr>
-              <w:t xml:space="preserve">Removed within 30 business days, but 6 memberships (MIA25142, MIA25172, MIA25175, X453396) were members again on November 25, 2025 - removal not sustained, no approved request (E3).</w:t>
+              <w:t xml:space="preserve">Not evidenced - the AD extract shows the revoked members without comment; no exception record.</w:t>
             </w:r>
           </w:p>
         </w:tc>
@@ -1929,7 +1929,7 @@
               <w:rPr>
                 <w:sz w:val="16"/>
               </w:rPr>
-              <w:t xml:space="preserve">Information reliability (A7)</w:t>
+              <w:t xml:space="preserve">7. Escalation and Remediation</w:t>
             </w:r>
           </w:p>
         </w:tc>
@@ -1953,7 +1953,7 @@
               <w:rPr>
                 <w:sz w:val="16"/>
               </w:rPr>
-              <w:t xml:space="preserve">Certification export, AD extract, Netwrix logs.</w:t>
+              <w:t xml:space="preserve">Escalation, remediation owner and tracking for the exceptions.</w:t>
             </w:r>
           </w:p>
         </w:tc>
@@ -1977,9 +1977,9 @@
             <w:r>
               <w:rPr>
                 <w:sz w:val="16"/>
-                <w:color w:val="B45F06"/>
+                <w:color w:val="C00000"/>
               </w:rPr>
-              <w:t xml:space="preserve">Pass (observation)</w:t>
+              <w:t xml:space="preserve">Fail</w:t>
             </w:r>
           </w:p>
         </w:tc>
@@ -2003,7 +2003,215 @@
               <w:rPr>
                 <w:sz w:val="16"/>
               </w:rPr>
-              <w:t xml:space="preserve">Reports reconcile; AD extract shows revoked members still present without comment; IAMS termination date inconsistent with AD expiration (01/01/2026).</w:t>
+              <w:t xml:space="preserve">Not evidenced - the same accounts were approved again in 2026 Q1.</w:t>
+            </w:r>
+          </w:p>
+        </w:tc>
+      </w:tr>
+      <w:tr>
+        <w:trPr>
+          <w:cantSplit/>
+          <w:jc w:val="center"/>
+        </w:trPr>
+        <w:tc>
+          <w:tcPr>
+            <w:tcW w:w="2556" w:type="dxa"/>
+            <w:shd w:val="clear" w:color="auto" w:fill="FFFFFF"/>
+            <w:tcMar>
+              <w:top w:w="110" w:type="dxa"/>
+              <w:left w:w="110" w:type="dxa"/>
+              <w:bottom w:w="110" w:type="dxa"/>
+              <w:right w:w="110" w:type="dxa"/>
+            </w:tcMar>
+            <w:vAlign w:val="center"/>
+          </w:tcPr>
+          <w:p>
+            <w:pPr>
+              <w:spacing w:after="0" w:line="240" w:lineRule="auto"/>
+            </w:pPr>
+            <w:r>
+              <w:rPr>
+                <w:sz w:val="16"/>
+              </w:rPr>
+              <w:t xml:space="preserve">8. Risk Mitigation</w:t>
+            </w:r>
+          </w:p>
+        </w:tc>
+        <w:tc>
+          <w:tcPr>
+            <w:tcW w:w="2556" w:type="dxa"/>
+            <w:shd w:val="clear" w:color="auto" w:fill="FFFFFF"/>
+            <w:tcMar>
+              <w:top w:w="110" w:type="dxa"/>
+              <w:left w:w="110" w:type="dxa"/>
+              <w:bottom w:w="110" w:type="dxa"/>
+              <w:right w:w="110" w:type="dxa"/>
+            </w:tcMar>
+            <w:vAlign w:val="center"/>
+          </w:tcPr>
+          <w:p>
+            <w:pPr>
+              <w:spacing w:after="0" w:line="240" w:lineRule="auto"/>
+            </w:pPr>
+            <w:r>
+              <w:rPr>
+                <w:sz w:val="16"/>
+              </w:rPr>
+              <w:t xml:space="preserve">Steps 2-7.</w:t>
+            </w:r>
+          </w:p>
+        </w:tc>
+        <w:tc>
+          <w:tcPr>
+            <w:tcW w:w="2556" w:type="dxa"/>
+            <w:shd w:val="clear" w:color="auto" w:fill="FFFFFF"/>
+            <w:tcMar>
+              <w:top w:w="110" w:type="dxa"/>
+              <w:left w:w="110" w:type="dxa"/>
+              <w:bottom w:w="110" w:type="dxa"/>
+              <w:right w:w="110" w:type="dxa"/>
+            </w:tcMar>
+            <w:vAlign w:val="center"/>
+          </w:tcPr>
+          <w:p>
+            <w:pPr>
+              <w:spacing w:after="0" w:line="240" w:lineRule="auto"/>
+              <w:jc w:val="center"/>
+            </w:pPr>
+            <w:r>
+              <w:rPr>
+                <w:sz w:val="16"/>
+                <w:color w:val="C00000"/>
+              </w:rPr>
+              <w:t xml:space="preserve">Fail</w:t>
+            </w:r>
+          </w:p>
+        </w:tc>
+        <w:tc>
+          <w:tcPr>
+            <w:tcW w:w="2556" w:type="dxa"/>
+            <w:shd w:val="clear" w:color="auto" w:fill="FFFFFF"/>
+            <w:tcMar>
+              <w:top w:w="110" w:type="dxa"/>
+              <w:left w:w="110" w:type="dxa"/>
+              <w:bottom w:w="110" w:type="dxa"/>
+              <w:right w:w="110" w:type="dxa"/>
+            </w:tcMar>
+            <w:vAlign w:val="center"/>
+          </w:tcPr>
+          <w:p>
+            <w:pPr>
+              <w:spacing w:after="0" w:line="240" w:lineRule="auto"/>
+            </w:pPr>
+            <w:r>
+              <w:rPr>
+                <w:sz w:val="16"/>
+              </w:rPr>
+              <w:t xml:space="preserve">The review does not identify terminated / disabled accounts and revocations were not sustained in CISCO Network Administrators and ISEAdmin; risk not mitigated.</w:t>
+            </w:r>
+          </w:p>
+        </w:tc>
+      </w:tr>
+      <w:tr>
+        <w:trPr>
+          <w:cantSplit/>
+          <w:jc w:val="center"/>
+        </w:trPr>
+        <w:tc>
+          <w:tcPr>
+            <w:tcW w:w="2556" w:type="dxa"/>
+            <w:shd w:val="clear" w:color="auto" w:fill="F8FAFC"/>
+            <w:tcMar>
+              <w:top w:w="110" w:type="dxa"/>
+              <w:left w:w="110" w:type="dxa"/>
+              <w:bottom w:w="110" w:type="dxa"/>
+              <w:right w:w="110" w:type="dxa"/>
+            </w:tcMar>
+            <w:vAlign w:val="center"/>
+          </w:tcPr>
+          <w:p>
+            <w:pPr>
+              <w:spacing w:after="0" w:line="240" w:lineRule="auto"/>
+            </w:pPr>
+            <w:r>
+              <w:rPr>
+                <w:sz w:val="16"/>
+              </w:rPr>
+              <w:t xml:space="preserve">9. Testing Coverage</w:t>
+            </w:r>
+          </w:p>
+        </w:tc>
+        <w:tc>
+          <w:tcPr>
+            <w:tcW w:w="2556" w:type="dxa"/>
+            <w:shd w:val="clear" w:color="auto" w:fill="F8FAFC"/>
+            <w:tcMar>
+              <w:top w:w="110" w:type="dxa"/>
+              <w:left w:w="110" w:type="dxa"/>
+              <w:bottom w:w="110" w:type="dxa"/>
+              <w:right w:w="110" w:type="dxa"/>
+            </w:tcMar>
+            <w:vAlign w:val="center"/>
+          </w:tcPr>
+          <w:p>
+            <w:pPr>
+              <w:spacing w:after="0" w:line="240" w:lineRule="auto"/>
+            </w:pPr>
+            <w:r>
+              <w:rPr>
+                <w:sz w:val="16"/>
+              </w:rPr>
+              <w:t xml:space="preserve">Completeness, scope, initiation, reviewer authorization, execution, revocation decisions, timeliness, exception management, escalation, risk mitigation.</w:t>
+            </w:r>
+          </w:p>
+        </w:tc>
+        <w:tc>
+          <w:tcPr>
+            <w:tcW w:w="2556" w:type="dxa"/>
+            <w:shd w:val="clear" w:color="auto" w:fill="F8FAFC"/>
+            <w:tcMar>
+              <w:top w:w="110" w:type="dxa"/>
+              <w:left w:w="110" w:type="dxa"/>
+              <w:bottom w:w="110" w:type="dxa"/>
+              <w:right w:w="110" w:type="dxa"/>
+            </w:tcMar>
+            <w:vAlign w:val="center"/>
+          </w:tcPr>
+          <w:p>
+            <w:pPr>
+              <w:spacing w:after="0" w:line="240" w:lineRule="auto"/>
+              <w:jc w:val="center"/>
+            </w:pPr>
+            <w:r>
+              <w:rPr>
+                <w:sz w:val="16"/>
+                <w:color w:val="C00000"/>
+              </w:rPr>
+              <w:t xml:space="preserve">Fail</w:t>
+            </w:r>
+          </w:p>
+        </w:tc>
+        <w:tc>
+          <w:tcPr>
+            <w:tcW w:w="2556" w:type="dxa"/>
+            <w:shd w:val="clear" w:color="auto" w:fill="F8FAFC"/>
+            <w:tcMar>
+              <w:top w:w="110" w:type="dxa"/>
+              <w:left w:w="110" w:type="dxa"/>
+              <w:bottom w:w="110" w:type="dxa"/>
+              <w:right w:w="110" w:type="dxa"/>
+            </w:tcMar>
+            <w:vAlign w:val="center"/>
+          </w:tcPr>
+          <w:p>
+            <w:pPr>
+              <w:spacing w:after="0" w:line="240" w:lineRule="auto"/>
+            </w:pPr>
+            <w:r>
+              <w:rPr>
+                <w:sz w:val="16"/>
+              </w:rPr>
+              <w:t xml:space="preserve">Sample result Fail; with Sample 2 (2026 Q1, Fail) the control is Needs Improvement. Detail: BSI.IT.27.C7.05 tabs 2 and 8.</w:t>
             </w:r>
           </w:p>
         </w:tc>

</xml_diff>